<commit_message>
Safety report signed and approved :)
</commit_message>
<xml_diff>
--- a/General Safety Induction/Safety Report - 24989142 - L Matota.docx
+++ b/General Safety Induction/Safety Report - 24989142 - L Matota.docx
@@ -435,7 +435,7 @@
                                       <w:sz w:val="24"/>
                                       <w:szCs w:val="24"/>
                                     </w:rPr>
-                                    <w:t>Karl Zapke</w:t>
+                                    <w:t>Kevin Neaves</w:t>
                                   </w:r>
                                 </w:p>
                               </w:tc>
@@ -694,7 +694,7 @@
                                       <w:sz w:val="24"/>
                                       <w:szCs w:val="24"/>
                                     </w:rPr>
-                                    <w:t>Karl Zapke</w:t>
+                                    <w:t>Kevin Neaves</w:t>
                                   </w:r>
                                 </w:p>
                               </w:tc>
@@ -717,7 +717,7 @@
                                       <w:sz w:val="24"/>
                                       <w:szCs w:val="24"/>
                                     </w:rPr>
-                                    <w:t>M6029</w:t>
+                                    <w:t>M</w:t>
                                   </w:r>
                                   <w:r>
                                     <w:rPr>
@@ -725,7 +725,7 @@
                                       <w:sz w:val="24"/>
                                       <w:szCs w:val="24"/>
                                     </w:rPr>
-                                    <w:t xml:space="preserve"> </w:t>
+                                    <w:t>3001</w:t>
                                   </w:r>
                                 </w:p>
                               </w:tc>
@@ -771,7 +771,7 @@
                                       <w:sz w:val="24"/>
                                       <w:szCs w:val="24"/>
                                     </w:rPr>
-                                    <w:t>082 714 9512</w:t>
+                                    <w:t>-</w:t>
                                   </w:r>
                                 </w:p>
                               </w:tc>
@@ -1561,7 +1561,7 @@
                                       <w:sz w:val="22"/>
                                       <w:szCs w:val="22"/>
                                     </w:rPr>
-                                    <w:t>Karl Zapke</w:t>
+                                    <w:t>Kevin Neaves</w:t>
                                   </w:r>
                                   <w:r>
                                     <w:rPr>
@@ -1762,6 +1762,7 @@
                                   <w14:uncheckedState w14:val="2610" w14:font="MS Gothic"/>
                                 </w14:checkbox>
                               </w:sdtPr>
+                              <w:sdtEndPr/>
                               <w:sdtContent>
                                 <w:r>
                                   <w:rPr>
@@ -1787,7 +1788,25 @@
                                 <w:sz w:val="18"/>
                                 <w:szCs w:val="18"/>
                               </w:rPr>
-                              <w:t>No pressure vessels or pipes with pressure in excess of 50kPa are involved in this project</w:t>
+                              <w:t xml:space="preserve">No pressure vessels or pipes with pressure </w:t>
+                            </w:r>
+                            <w:proofErr w:type="gramStart"/>
+                            <w:r>
+                              <w:rPr>
+                                <w:rFonts w:ascii="Arial" w:hAnsi="Arial"/>
+                                <w:sz w:val="18"/>
+                                <w:szCs w:val="18"/>
+                              </w:rPr>
+                              <w:t>in excess of</w:t>
+                            </w:r>
+                            <w:proofErr w:type="gramEnd"/>
+                            <w:r>
+                              <w:rPr>
+                                <w:rFonts w:ascii="Arial" w:hAnsi="Arial"/>
+                                <w:sz w:val="18"/>
+                                <w:szCs w:val="18"/>
+                              </w:rPr>
+                              <w:t xml:space="preserve"> 50kPa are involved in this project</w:t>
                             </w:r>
                             <w:r>
                               <w:rPr>
@@ -1820,6 +1839,7 @@
                                   <w14:uncheckedState w14:val="2610" w14:font="MS Gothic"/>
                                 </w14:checkbox>
                               </w:sdtPr>
+                              <w:sdtEndPr/>
                               <w:sdtContent>
                                 <w:r>
                                   <w:rPr>
@@ -1853,8 +1873,18 @@
                                 <w:sz w:val="18"/>
                                 <w:szCs w:val="18"/>
                               </w:rPr>
-                              <w:t>vessels or pipes in excess of</w:t>
+                              <w:t xml:space="preserve">vessels or pipes </w:t>
                             </w:r>
+                            <w:proofErr w:type="gramStart"/>
+                            <w:r>
+                              <w:rPr>
+                                <w:rFonts w:ascii="Arial" w:hAnsi="Arial"/>
+                                <w:sz w:val="18"/>
+                                <w:szCs w:val="18"/>
+                              </w:rPr>
+                              <w:t>in excess of</w:t>
+                            </w:r>
+                            <w:proofErr w:type="gramEnd"/>
                             <w:r>
                               <w:rPr>
                                 <w:rFonts w:ascii="Arial" w:hAnsi="Arial"/>
@@ -2015,6 +2045,7 @@
                                   <w14:uncheckedState w14:val="2610" w14:font="MS Gothic"/>
                                 </w14:checkbox>
                               </w:sdtPr>
+                              <w:sdtEndPr/>
                               <w:sdtContent>
                                 <w:r>
                                   <w:rPr>
@@ -2066,6 +2097,7 @@
                                   <w14:uncheckedState w14:val="2610" w14:font="MS Gothic"/>
                                 </w14:checkbox>
                               </w:sdtPr>
+                              <w:sdtEndPr/>
                               <w:sdtContent>
                                 <w:r>
                                   <w:rPr>
@@ -2516,7 +2548,7 @@
                                 <w:sz w:val="24"/>
                                 <w:szCs w:val="24"/>
                               </w:rPr>
-                              <w:t>Karl Zapke</w:t>
+                              <w:t>Kevin Neaves</w:t>
                             </w:r>
                           </w:p>
                         </w:tc>
@@ -2775,7 +2807,7 @@
                                 <w:sz w:val="24"/>
                                 <w:szCs w:val="24"/>
                               </w:rPr>
-                              <w:t>Karl Zapke</w:t>
+                              <w:t>Kevin Neaves</w:t>
                             </w:r>
                           </w:p>
                         </w:tc>
@@ -2798,7 +2830,7 @@
                                 <w:sz w:val="24"/>
                                 <w:szCs w:val="24"/>
                               </w:rPr>
-                              <w:t>M6029</w:t>
+                              <w:t>M</w:t>
                             </w:r>
                             <w:r>
                               <w:rPr>
@@ -2806,7 +2838,7 @@
                                 <w:sz w:val="24"/>
                                 <w:szCs w:val="24"/>
                               </w:rPr>
-                              <w:t xml:space="preserve"> </w:t>
+                              <w:t>3001</w:t>
                             </w:r>
                           </w:p>
                         </w:tc>
@@ -2852,7 +2884,7 @@
                                 <w:sz w:val="24"/>
                                 <w:szCs w:val="24"/>
                               </w:rPr>
-                              <w:t>082 714 9512</w:t>
+                              <w:t>-</w:t>
                             </w:r>
                           </w:p>
                         </w:tc>
@@ -3642,7 +3674,7 @@
                                 <w:sz w:val="22"/>
                                 <w:szCs w:val="22"/>
                               </w:rPr>
-                              <w:t>Karl Zapke</w:t>
+                              <w:t>Kevin Neaves</w:t>
                             </w:r>
                             <w:r>
                               <w:rPr>
@@ -3843,6 +3875,7 @@
                             <w14:uncheckedState w14:val="2610" w14:font="MS Gothic"/>
                           </w14:checkbox>
                         </w:sdtPr>
+                        <w:sdtEndPr/>
                         <w:sdtContent>
                           <w:r>
                             <w:rPr>
@@ -3868,7 +3901,25 @@
                           <w:sz w:val="18"/>
                           <w:szCs w:val="18"/>
                         </w:rPr>
-                        <w:t>No pressure vessels or pipes with pressure in excess of 50kPa are involved in this project</w:t>
+                        <w:t xml:space="preserve">No pressure vessels or pipes with pressure </w:t>
+                      </w:r>
+                      <w:proofErr w:type="gramStart"/>
+                      <w:r>
+                        <w:rPr>
+                          <w:rFonts w:ascii="Arial" w:hAnsi="Arial"/>
+                          <w:sz w:val="18"/>
+                          <w:szCs w:val="18"/>
+                        </w:rPr>
+                        <w:t>in excess of</w:t>
+                      </w:r>
+                      <w:proofErr w:type="gramEnd"/>
+                      <w:r>
+                        <w:rPr>
+                          <w:rFonts w:ascii="Arial" w:hAnsi="Arial"/>
+                          <w:sz w:val="18"/>
+                          <w:szCs w:val="18"/>
+                        </w:rPr>
+                        <w:t xml:space="preserve"> 50kPa are involved in this project</w:t>
                       </w:r>
                       <w:r>
                         <w:rPr>
@@ -3901,6 +3952,7 @@
                             <w14:uncheckedState w14:val="2610" w14:font="MS Gothic"/>
                           </w14:checkbox>
                         </w:sdtPr>
+                        <w:sdtEndPr/>
                         <w:sdtContent>
                           <w:r>
                             <w:rPr>
@@ -3934,8 +3986,18 @@
                           <w:sz w:val="18"/>
                           <w:szCs w:val="18"/>
                         </w:rPr>
-                        <w:t>vessels or pipes in excess of</w:t>
+                        <w:t xml:space="preserve">vessels or pipes </w:t>
                       </w:r>
+                      <w:proofErr w:type="gramStart"/>
+                      <w:r>
+                        <w:rPr>
+                          <w:rFonts w:ascii="Arial" w:hAnsi="Arial"/>
+                          <w:sz w:val="18"/>
+                          <w:szCs w:val="18"/>
+                        </w:rPr>
+                        <w:t>in excess of</w:t>
+                      </w:r>
+                      <w:proofErr w:type="gramEnd"/>
                       <w:r>
                         <w:rPr>
                           <w:rFonts w:ascii="Arial" w:hAnsi="Arial"/>
@@ -4096,6 +4158,7 @@
                             <w14:uncheckedState w14:val="2610" w14:font="MS Gothic"/>
                           </w14:checkbox>
                         </w:sdtPr>
+                        <w:sdtEndPr/>
                         <w:sdtContent>
                           <w:r>
                             <w:rPr>
@@ -4147,6 +4210,7 @@
                             <w14:uncheckedState w14:val="2610" w14:font="MS Gothic"/>
                           </w14:checkbox>
                         </w:sdtPr>
+                        <w:sdtEndPr/>
                         <w:sdtContent>
                           <w:r>
                             <w:rPr>
@@ -5254,7 +5318,15 @@
                       <w:sz w:val="22"/>
                       <w:szCs w:val="22"/>
                     </w:rPr>
-                    <m:t>20 V</m:t>
+                    <m:t xml:space="preserve">20 </m:t>
+                  </m:r>
+                  <m:r>
+                    <w:rPr>
+                      <w:rFonts w:ascii="Cambria Math" w:eastAsia="Arial" w:hAnsi="Cambria Math"/>
+                      <w:sz w:val="22"/>
+                      <w:szCs w:val="22"/>
+                    </w:rPr>
+                    <m:t>V</m:t>
                   </m:r>
                 </m:e>
                 <m:sub>
@@ -5284,7 +5356,15 @@
                   <w:sz w:val="22"/>
                   <w:szCs w:val="22"/>
                 </w:rPr>
-                <m:t>18 A</m:t>
+                <m:t xml:space="preserve">18 </m:t>
+              </m:r>
+              <m:r>
+                <w:rPr>
+                  <w:rFonts w:ascii="Cambria Math" w:eastAsia="Arial" w:hAnsi="Cambria Math"/>
+                  <w:sz w:val="22"/>
+                  <w:szCs w:val="22"/>
+                </w:rPr>
+                <m:t>A</m:t>
               </m:r>
             </m:oMath>
           </w:p>
@@ -5440,7 +5520,15 @@
                   <w:sz w:val="22"/>
                   <w:szCs w:val="22"/>
                 </w:rPr>
-                <m:t>5-80 V</m:t>
+                <m:t xml:space="preserve">5-80 </m:t>
+              </m:r>
+              <m:r>
+                <w:rPr>
+                  <w:rFonts w:ascii="Cambria Math" w:eastAsia="Arial" w:hAnsi="Cambria Math"/>
+                  <w:sz w:val="22"/>
+                  <w:szCs w:val="22"/>
+                </w:rPr>
+                <m:t>V</m:t>
               </m:r>
             </m:oMath>
             <w:r>
@@ -5500,7 +5588,15 @@
                   <w:sz w:val="22"/>
                   <w:szCs w:val="22"/>
                 </w:rPr>
-                <m:t>5-20 V</m:t>
+                <m:t xml:space="preserve">5-20 </m:t>
+              </m:r>
+              <m:r>
+                <w:rPr>
+                  <w:rFonts w:ascii="Cambria Math" w:eastAsia="Arial" w:hAnsi="Cambria Math"/>
+                  <w:sz w:val="22"/>
+                  <w:szCs w:val="22"/>
+                </w:rPr>
+                <m:t>V</m:t>
               </m:r>
             </m:oMath>
             <w:r>
@@ -5518,7 +5614,15 @@
                   <w:sz w:val="22"/>
                   <w:szCs w:val="22"/>
                 </w:rPr>
-                <m:t>0.8 A</m:t>
+                <m:t xml:space="preserve">0.8 </m:t>
+              </m:r>
+              <m:r>
+                <w:rPr>
+                  <w:rFonts w:ascii="Cambria Math" w:eastAsia="Arial" w:hAnsi="Cambria Math"/>
+                  <w:sz w:val="22"/>
+                  <w:szCs w:val="22"/>
+                </w:rPr>
+                <m:t>A</m:t>
               </m:r>
             </m:oMath>
           </w:p>
@@ -8336,7 +8440,7 @@
                 <w:sz w:val="22"/>
                 <w:szCs w:val="22"/>
               </w:rPr>
-              <w:t>Karl Zapke</w:t>
+              <w:t>Kevin Neaves</w:t>
             </w:r>
             <w:r>
               <w:rPr>
@@ -9818,7 +9922,23 @@
           <w:sz w:val="22"/>
           <w:szCs w:val="22"/>
         </w:rPr>
-        <w:t xml:space="preserve">Closed shoes must be worn at all times. </w:t>
+        <w:t xml:space="preserve">Closed shoes must be </w:t>
+      </w:r>
+      <w:proofErr w:type="gramStart"/>
+      <w:r>
+        <w:rPr>
+          <w:sz w:val="22"/>
+          <w:szCs w:val="22"/>
+        </w:rPr>
+        <w:t>worn at all times</w:t>
+      </w:r>
+      <w:proofErr w:type="gramEnd"/>
+      <w:r>
+        <w:rPr>
+          <w:sz w:val="22"/>
+          <w:szCs w:val="22"/>
+        </w:rPr>
+        <w:t xml:space="preserve">. </w:t>
       </w:r>
     </w:p>
     <w:p>
@@ -9967,19 +10087,37 @@
           <w:szCs w:val="22"/>
         </w:rPr>
       </w:pPr>
-      <w:r>
-        <w:rPr>
-          <w:sz w:val="22"/>
-          <w:szCs w:val="22"/>
-        </w:rPr>
-        <w:t xml:space="preserve">Loose clothing may not be worn. </w:t>
-      </w:r>
-      <w:r>
-        <w:rPr>
-          <w:sz w:val="22"/>
-          <w:szCs w:val="22"/>
-        </w:rPr>
-        <w:t xml:space="preserve">Loose hair must be tied up. </w:t>
+      <w:proofErr w:type="gramStart"/>
+      <w:r>
+        <w:rPr>
+          <w:sz w:val="22"/>
+          <w:szCs w:val="22"/>
+        </w:rPr>
+        <w:t>Loose</w:t>
+      </w:r>
+      <w:proofErr w:type="gramEnd"/>
+      <w:r>
+        <w:rPr>
+          <w:sz w:val="22"/>
+          <w:szCs w:val="22"/>
+        </w:rPr>
+        <w:t xml:space="preserve"> clothing may not be worn. </w:t>
+      </w:r>
+      <w:proofErr w:type="gramStart"/>
+      <w:r>
+        <w:rPr>
+          <w:sz w:val="22"/>
+          <w:szCs w:val="22"/>
+        </w:rPr>
+        <w:t>Loose</w:t>
+      </w:r>
+      <w:proofErr w:type="gramEnd"/>
+      <w:r>
+        <w:rPr>
+          <w:sz w:val="22"/>
+          <w:szCs w:val="22"/>
+        </w:rPr>
+        <w:t xml:space="preserve"> hair must be tied up. </w:t>
       </w:r>
     </w:p>
     <w:p>
@@ -10364,7 +10502,25 @@
           <w:sz w:val="22"/>
           <w:szCs w:val="22"/>
         </w:rPr>
-        <w:t xml:space="preserve">Furthermore, the Manson DC power supply and all control circuitry will be </w:t>
+        <w:t xml:space="preserve">Furthermore, the Manson DC power supply and all control </w:t>
+      </w:r>
+      <w:proofErr w:type="gramStart"/>
+      <w:r>
+        <w:rPr>
+          <w:rFonts w:ascii="Arial" w:eastAsia="Arial" w:hAnsi="Arial"/>
+          <w:sz w:val="22"/>
+          <w:szCs w:val="22"/>
+        </w:rPr>
+        <w:t>circuitry</w:t>
+      </w:r>
+      <w:proofErr w:type="gramEnd"/>
+      <w:r>
+        <w:rPr>
+          <w:rFonts w:ascii="Arial" w:eastAsia="Arial" w:hAnsi="Arial"/>
+          <w:sz w:val="22"/>
+          <w:szCs w:val="22"/>
+        </w:rPr>
+        <w:t xml:space="preserve"> will be </w:t>
       </w:r>
       <w:r>
         <w:rPr>
@@ -12233,7 +12389,25 @@
           <w:sz w:val="22"/>
           <w:szCs w:val="22"/>
         </w:rPr>
-        <w:t>Failure to comply with any of the aforementioned safety regulations</w:t>
+        <w:t xml:space="preserve">Failure to comply with any of the </w:t>
+      </w:r>
+      <w:proofErr w:type="gramStart"/>
+      <w:r>
+        <w:rPr>
+          <w:rFonts w:ascii="Arial" w:eastAsia="Arial" w:hAnsi="Arial" w:cs="Arial"/>
+          <w:sz w:val="22"/>
+          <w:szCs w:val="22"/>
+        </w:rPr>
+        <w:t>aforementioned safety</w:t>
+      </w:r>
+      <w:proofErr w:type="gramEnd"/>
+      <w:r>
+        <w:rPr>
+          <w:rFonts w:ascii="Arial" w:eastAsia="Arial" w:hAnsi="Arial" w:cs="Arial"/>
+          <w:sz w:val="22"/>
+          <w:szCs w:val="22"/>
+        </w:rPr>
+        <w:t xml:space="preserve"> regulations</w:t>
       </w:r>
       <w:r>
         <w:rPr>
@@ -12354,522 +12528,74 @@
           <w:noProof/>
           <w:vertAlign w:val="subscript"/>
         </w:rPr>
+        <w:softHyphen/>
+      </w:r>
+      <w:r>
+        <w:rPr>
+          <w:noProof/>
+          <w:vertAlign w:val="subscript"/>
+        </w:rPr>
+        <w:softHyphen/>
+      </w:r>
+      <w:r>
+        <w:rPr>
+          <w:noProof/>
+          <w:vertAlign w:val="subscript"/>
+        </w:rPr>
+        <w:drawing>
+          <wp:inline distT="0" distB="0" distL="0" distR="0" wp14:anchorId="11253CAD" wp14:editId="3EA42344">
+            <wp:extent cx="5794744" cy="8005773"/>
+            <wp:effectExtent l="0" t="0" r="0" b="0"/>
+            <wp:docPr id="1496859951" name="Picture 1"/>
+            <wp:cNvGraphicFramePr>
+              <a:graphicFrameLocks xmlns:a="http://schemas.openxmlformats.org/drawingml/2006/main" noChangeAspect="1"/>
+            </wp:cNvGraphicFramePr>
+            <a:graphic xmlns:a="http://schemas.openxmlformats.org/drawingml/2006/main">
+              <a:graphicData uri="http://schemas.openxmlformats.org/drawingml/2006/picture">
+                <pic:pic xmlns:pic="http://schemas.openxmlformats.org/drawingml/2006/picture">
+                  <pic:nvPicPr>
+                    <pic:cNvPr id="1496859951" name=""/>
+                    <pic:cNvPicPr/>
+                  </pic:nvPicPr>
+                  <pic:blipFill rotWithShape="1">
+                    <a:blip r:embed="rId18"/>
+                    <a:srcRect r="1484"/>
+                    <a:stretch>
+                      <a:fillRect/>
+                    </a:stretch>
+                  </pic:blipFill>
+                  <pic:spPr bwMode="auto">
+                    <a:xfrm>
+                      <a:off x="0" y="0"/>
+                      <a:ext cx="5799663" cy="8012569"/>
+                    </a:xfrm>
+                    <a:prstGeom prst="rect">
+                      <a:avLst/>
+                    </a:prstGeom>
+                    <a:ln>
+                      <a:noFill/>
+                    </a:ln>
+                    <a:extLst>
+                      <a:ext uri="{53640926-AAD7-44D8-BBD7-CCE9431645EC}">
+                        <a14:shadowObscured xmlns:a14="http://schemas.microsoft.com/office/drawing/2010/main"/>
+                      </a:ext>
+                    </a:extLst>
+                  </pic:spPr>
+                </pic:pic>
+              </a:graphicData>
+            </a:graphic>
+          </wp:inline>
+        </w:drawing>
+      </w:r>
+      <w:r>
+        <w:rPr>
+          <w:noProof/>
+          <w:vertAlign w:val="subscript"/>
+        </w:rPr>
         <mc:AlternateContent>
           <mc:Choice Requires="wps">
             <w:drawing>
-              <wp:anchor distT="0" distB="0" distL="114300" distR="114300" simplePos="0" relativeHeight="251658252" behindDoc="0" locked="0" layoutInCell="1" allowOverlap="1" wp14:anchorId="6AC445A4" wp14:editId="675CC632">
-                <wp:simplePos x="0" y="0"/>
-                <wp:positionH relativeFrom="column">
-                  <wp:posOffset>2231720</wp:posOffset>
-                </wp:positionH>
-                <wp:positionV relativeFrom="paragraph">
-                  <wp:posOffset>7847020</wp:posOffset>
-                </wp:positionV>
-                <wp:extent cx="222865" cy="222855"/>
-                <wp:effectExtent l="0" t="0" r="25400" b="25400"/>
-                <wp:wrapNone/>
-                <wp:docPr id="19" name="Oval 19"/>
-                <wp:cNvGraphicFramePr/>
-                <a:graphic xmlns:a="http://schemas.openxmlformats.org/drawingml/2006/main">
-                  <a:graphicData uri="http://schemas.microsoft.com/office/word/2010/wordprocessingShape">
-                    <wps:wsp>
-                      <wps:cNvSpPr/>
-                      <wps:spPr>
-                        <a:xfrm>
-                          <a:off x="0" y="0"/>
-                          <a:ext cx="222865" cy="222855"/>
-                        </a:xfrm>
-                        <a:prstGeom prst="ellipse">
-                          <a:avLst/>
-                        </a:prstGeom>
-                        <a:noFill/>
-                        <a:ln>
-                          <a:solidFill>
-                            <a:srgbClr val="FF0000"/>
-                          </a:solidFill>
-                        </a:ln>
-                      </wps:spPr>
-                      <wps:style>
-                        <a:lnRef idx="2">
-                          <a:schemeClr val="accent1">
-                            <a:shade val="15000"/>
-                          </a:schemeClr>
-                        </a:lnRef>
-                        <a:fillRef idx="1">
-                          <a:schemeClr val="accent1"/>
-                        </a:fillRef>
-                        <a:effectRef idx="0">
-                          <a:schemeClr val="accent1"/>
-                        </a:effectRef>
-                        <a:fontRef idx="minor">
-                          <a:schemeClr val="lt1"/>
-                        </a:fontRef>
-                      </wps:style>
-                      <wps:bodyPr rot="0" spcFirstLastPara="0" vertOverflow="overflow" horzOverflow="overflow" vert="horz" wrap="square" lIns="91440" tIns="45720" rIns="91440" bIns="45720" numCol="1" spcCol="0" rtlCol="0" fromWordArt="0" anchor="ctr" anchorCtr="0" forceAA="0" compatLnSpc="1">
-                        <a:prstTxWarp prst="textNoShape">
-                          <a:avLst/>
-                        </a:prstTxWarp>
-                        <a:noAutofit/>
-                      </wps:bodyPr>
-                    </wps:wsp>
-                  </a:graphicData>
-                </a:graphic>
-                <wp14:sizeRelH relativeFrom="margin">
-                  <wp14:pctWidth>0</wp14:pctWidth>
-                </wp14:sizeRelH>
-                <wp14:sizeRelV relativeFrom="margin">
-                  <wp14:pctHeight>0</wp14:pctHeight>
-                </wp14:sizeRelV>
-              </wp:anchor>
-            </w:drawing>
-          </mc:Choice>
-          <mc:Fallback>
-            <w:pict>
-              <v:oval w14:anchorId="21A9F91F" id="Oval 19" o:spid="_x0000_s1026" style="position:absolute;margin-left:175.75pt;margin-top:617.9pt;width:17.55pt;height:17.55pt;z-index:251658252;visibility:visible;mso-wrap-style:square;mso-width-percent:0;mso-height-percent:0;mso-wrap-distance-left:9pt;mso-wrap-distance-top:0;mso-wrap-distance-right:9pt;mso-wrap-distance-bottom:0;mso-position-horizontal:absolute;mso-position-horizontal-relative:text;mso-position-vertical:absolute;mso-position-vertical-relative:text;mso-width-percent:0;mso-height-percent:0;mso-width-relative:margin;mso-height-relative:margin;v-text-anchor:middle" o:gfxdata="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" filled="f" strokecolor="red" strokeweight="1pt">
-                <v:stroke joinstyle="miter"/>
-              </v:oval>
-            </w:pict>
-          </mc:Fallback>
-        </mc:AlternateContent>
-      </w:r>
-      <w:r>
-        <w:rPr>
-          <w:noProof/>
-          <w:vertAlign w:val="subscript"/>
-        </w:rPr>
-        <mc:AlternateContent>
-          <mc:Choice Requires="wps">
-            <w:drawing>
-              <wp:anchor distT="0" distB="0" distL="114300" distR="114300" simplePos="0" relativeHeight="251658250" behindDoc="0" locked="0" layoutInCell="1" allowOverlap="1" wp14:anchorId="12336EE6" wp14:editId="236823AC">
-                <wp:simplePos x="0" y="0"/>
-                <wp:positionH relativeFrom="column">
-                  <wp:posOffset>2397850</wp:posOffset>
-                </wp:positionH>
-                <wp:positionV relativeFrom="paragraph">
-                  <wp:posOffset>1399270</wp:posOffset>
-                </wp:positionV>
-                <wp:extent cx="222865" cy="222855"/>
-                <wp:effectExtent l="0" t="0" r="25400" b="25400"/>
-                <wp:wrapNone/>
-                <wp:docPr id="17" name="Oval 17"/>
-                <wp:cNvGraphicFramePr/>
-                <a:graphic xmlns:a="http://schemas.openxmlformats.org/drawingml/2006/main">
-                  <a:graphicData uri="http://schemas.microsoft.com/office/word/2010/wordprocessingShape">
-                    <wps:wsp>
-                      <wps:cNvSpPr/>
-                      <wps:spPr>
-                        <a:xfrm>
-                          <a:off x="0" y="0"/>
-                          <a:ext cx="222865" cy="222855"/>
-                        </a:xfrm>
-                        <a:prstGeom prst="ellipse">
-                          <a:avLst/>
-                        </a:prstGeom>
-                        <a:noFill/>
-                        <a:ln>
-                          <a:solidFill>
-                            <a:srgbClr val="FF0000"/>
-                          </a:solidFill>
-                        </a:ln>
-                      </wps:spPr>
-                      <wps:style>
-                        <a:lnRef idx="2">
-                          <a:schemeClr val="accent1">
-                            <a:shade val="15000"/>
-                          </a:schemeClr>
-                        </a:lnRef>
-                        <a:fillRef idx="1">
-                          <a:schemeClr val="accent1"/>
-                        </a:fillRef>
-                        <a:effectRef idx="0">
-                          <a:schemeClr val="accent1"/>
-                        </a:effectRef>
-                        <a:fontRef idx="minor">
-                          <a:schemeClr val="lt1"/>
-                        </a:fontRef>
-                      </wps:style>
-                      <wps:bodyPr rot="0" spcFirstLastPara="0" vertOverflow="overflow" horzOverflow="overflow" vert="horz" wrap="square" lIns="91440" tIns="45720" rIns="91440" bIns="45720" numCol="1" spcCol="0" rtlCol="0" fromWordArt="0" anchor="ctr" anchorCtr="0" forceAA="0" compatLnSpc="1">
-                        <a:prstTxWarp prst="textNoShape">
-                          <a:avLst/>
-                        </a:prstTxWarp>
-                        <a:noAutofit/>
-                      </wps:bodyPr>
-                    </wps:wsp>
-                  </a:graphicData>
-                </a:graphic>
-                <wp14:sizeRelH relativeFrom="margin">
-                  <wp14:pctWidth>0</wp14:pctWidth>
-                </wp14:sizeRelH>
-                <wp14:sizeRelV relativeFrom="margin">
-                  <wp14:pctHeight>0</wp14:pctHeight>
-                </wp14:sizeRelV>
-              </wp:anchor>
-            </w:drawing>
-          </mc:Choice>
-          <mc:Fallback>
-            <w:pict>
-              <v:oval w14:anchorId="25CCD277" id="Oval 17" o:spid="_x0000_s1026" style="position:absolute;margin-left:188.8pt;margin-top:110.2pt;width:17.55pt;height:17.55pt;z-index:251658250;visibility:visible;mso-wrap-style:square;mso-width-percent:0;mso-height-percent:0;mso-wrap-distance-left:9pt;mso-wrap-distance-top:0;mso-wrap-distance-right:9pt;mso-wrap-distance-bottom:0;mso-position-horizontal:absolute;mso-position-horizontal-relative:text;mso-position-vertical:absolute;mso-position-vertical-relative:text;mso-width-percent:0;mso-height-percent:0;mso-width-relative:margin;mso-height-relative:margin;v-text-anchor:middle" o:gfxdata="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" filled="f" strokecolor="red" strokeweight="1pt">
-                <v:stroke joinstyle="miter"/>
-              </v:oval>
-            </w:pict>
-          </mc:Fallback>
-        </mc:AlternateContent>
-      </w:r>
-      <w:r>
-        <w:rPr>
-          <w:noProof/>
-          <w:vertAlign w:val="subscript"/>
-        </w:rPr>
-        <mc:AlternateContent>
-          <mc:Choice Requires="wps">
-            <w:drawing>
-              <wp:anchor distT="0" distB="0" distL="114300" distR="114300" simplePos="0" relativeHeight="251658251" behindDoc="0" locked="0" layoutInCell="1" allowOverlap="1" wp14:anchorId="31FDB3C8" wp14:editId="0A66B2CD">
-                <wp:simplePos x="0" y="0"/>
-                <wp:positionH relativeFrom="column">
-                  <wp:posOffset>2390580</wp:posOffset>
-                </wp:positionH>
-                <wp:positionV relativeFrom="paragraph">
-                  <wp:posOffset>751200</wp:posOffset>
-                </wp:positionV>
-                <wp:extent cx="222865" cy="222855"/>
-                <wp:effectExtent l="0" t="0" r="25400" b="25400"/>
-                <wp:wrapNone/>
-                <wp:docPr id="18" name="Oval 18"/>
-                <wp:cNvGraphicFramePr/>
-                <a:graphic xmlns:a="http://schemas.openxmlformats.org/drawingml/2006/main">
-                  <a:graphicData uri="http://schemas.microsoft.com/office/word/2010/wordprocessingShape">
-                    <wps:wsp>
-                      <wps:cNvSpPr/>
-                      <wps:spPr>
-                        <a:xfrm>
-                          <a:off x="0" y="0"/>
-                          <a:ext cx="222865" cy="222855"/>
-                        </a:xfrm>
-                        <a:prstGeom prst="ellipse">
-                          <a:avLst/>
-                        </a:prstGeom>
-                        <a:noFill/>
-                        <a:ln>
-                          <a:solidFill>
-                            <a:srgbClr val="FF0000"/>
-                          </a:solidFill>
-                        </a:ln>
-                      </wps:spPr>
-                      <wps:style>
-                        <a:lnRef idx="2">
-                          <a:schemeClr val="accent1">
-                            <a:shade val="15000"/>
-                          </a:schemeClr>
-                        </a:lnRef>
-                        <a:fillRef idx="1">
-                          <a:schemeClr val="accent1"/>
-                        </a:fillRef>
-                        <a:effectRef idx="0">
-                          <a:schemeClr val="accent1"/>
-                        </a:effectRef>
-                        <a:fontRef idx="minor">
-                          <a:schemeClr val="lt1"/>
-                        </a:fontRef>
-                      </wps:style>
-                      <wps:bodyPr rot="0" spcFirstLastPara="0" vertOverflow="overflow" horzOverflow="overflow" vert="horz" wrap="square" lIns="91440" tIns="45720" rIns="91440" bIns="45720" numCol="1" spcCol="0" rtlCol="0" fromWordArt="0" anchor="ctr" anchorCtr="0" forceAA="0" compatLnSpc="1">
-                        <a:prstTxWarp prst="textNoShape">
-                          <a:avLst/>
-                        </a:prstTxWarp>
-                        <a:noAutofit/>
-                      </wps:bodyPr>
-                    </wps:wsp>
-                  </a:graphicData>
-                </a:graphic>
-                <wp14:sizeRelH relativeFrom="margin">
-                  <wp14:pctWidth>0</wp14:pctWidth>
-                </wp14:sizeRelH>
-                <wp14:sizeRelV relativeFrom="margin">
-                  <wp14:pctHeight>0</wp14:pctHeight>
-                </wp14:sizeRelV>
-              </wp:anchor>
-            </w:drawing>
-          </mc:Choice>
-          <mc:Fallback>
-            <w:pict>
-              <v:oval w14:anchorId="1595CCCD" id="Oval 18" o:spid="_x0000_s1026" style="position:absolute;margin-left:188.25pt;margin-top:59.15pt;width:17.55pt;height:17.55pt;z-index:251658251;visibility:visible;mso-wrap-style:square;mso-width-percent:0;mso-height-percent:0;mso-wrap-distance-left:9pt;mso-wrap-distance-top:0;mso-wrap-distance-right:9pt;mso-wrap-distance-bottom:0;mso-position-horizontal:absolute;mso-position-horizontal-relative:text;mso-position-vertical:absolute;mso-position-vertical-relative:text;mso-width-percent:0;mso-height-percent:0;mso-width-relative:margin;mso-height-relative:margin;v-text-anchor:middle" o:gfxdata="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" filled="f" strokecolor="red" strokeweight="1pt">
-                <v:stroke joinstyle="miter"/>
-              </v:oval>
-            </w:pict>
-          </mc:Fallback>
-        </mc:AlternateContent>
-      </w:r>
-      <w:r>
-        <w:rPr>
-          <w:noProof/>
-          <w:vertAlign w:val="subscript"/>
-        </w:rPr>
-        <mc:AlternateContent>
-          <mc:Choice Requires="wps">
-            <w:drawing>
-              <wp:anchor distT="0" distB="0" distL="114300" distR="114300" simplePos="0" relativeHeight="251658249" behindDoc="0" locked="0" layoutInCell="1" allowOverlap="1" wp14:anchorId="6F35B68F" wp14:editId="5E56C1FD">
-                <wp:simplePos x="0" y="0"/>
-                <wp:positionH relativeFrom="column">
-                  <wp:posOffset>2173805</wp:posOffset>
-                </wp:positionH>
-                <wp:positionV relativeFrom="paragraph">
-                  <wp:posOffset>4556780</wp:posOffset>
-                </wp:positionV>
-                <wp:extent cx="222865" cy="222855"/>
-                <wp:effectExtent l="0" t="0" r="25400" b="25400"/>
-                <wp:wrapNone/>
-                <wp:docPr id="15" name="Oval 15"/>
-                <wp:cNvGraphicFramePr/>
-                <a:graphic xmlns:a="http://schemas.openxmlformats.org/drawingml/2006/main">
-                  <a:graphicData uri="http://schemas.microsoft.com/office/word/2010/wordprocessingShape">
-                    <wps:wsp>
-                      <wps:cNvSpPr/>
-                      <wps:spPr>
-                        <a:xfrm>
-                          <a:off x="0" y="0"/>
-                          <a:ext cx="222865" cy="222855"/>
-                        </a:xfrm>
-                        <a:prstGeom prst="ellipse">
-                          <a:avLst/>
-                        </a:prstGeom>
-                        <a:noFill/>
-                        <a:ln>
-                          <a:solidFill>
-                            <a:srgbClr val="FF0000"/>
-                          </a:solidFill>
-                        </a:ln>
-                      </wps:spPr>
-                      <wps:style>
-                        <a:lnRef idx="2">
-                          <a:schemeClr val="accent1">
-                            <a:shade val="15000"/>
-                          </a:schemeClr>
-                        </a:lnRef>
-                        <a:fillRef idx="1">
-                          <a:schemeClr val="accent1"/>
-                        </a:fillRef>
-                        <a:effectRef idx="0">
-                          <a:schemeClr val="accent1"/>
-                        </a:effectRef>
-                        <a:fontRef idx="minor">
-                          <a:schemeClr val="lt1"/>
-                        </a:fontRef>
-                      </wps:style>
-                      <wps:bodyPr rot="0" spcFirstLastPara="0" vertOverflow="overflow" horzOverflow="overflow" vert="horz" wrap="square" lIns="91440" tIns="45720" rIns="91440" bIns="45720" numCol="1" spcCol="0" rtlCol="0" fromWordArt="0" anchor="ctr" anchorCtr="0" forceAA="0" compatLnSpc="1">
-                        <a:prstTxWarp prst="textNoShape">
-                          <a:avLst/>
-                        </a:prstTxWarp>
-                        <a:noAutofit/>
-                      </wps:bodyPr>
-                    </wps:wsp>
-                  </a:graphicData>
-                </a:graphic>
-                <wp14:sizeRelH relativeFrom="margin">
-                  <wp14:pctWidth>0</wp14:pctWidth>
-                </wp14:sizeRelH>
-                <wp14:sizeRelV relativeFrom="margin">
-                  <wp14:pctHeight>0</wp14:pctHeight>
-                </wp14:sizeRelV>
-              </wp:anchor>
-            </w:drawing>
-          </mc:Choice>
-          <mc:Fallback>
-            <w:pict>
-              <v:oval w14:anchorId="0764F941" id="Oval 15" o:spid="_x0000_s1026" style="position:absolute;margin-left:171.15pt;margin-top:358.8pt;width:17.55pt;height:17.55pt;z-index:251658249;visibility:visible;mso-wrap-style:square;mso-width-percent:0;mso-height-percent:0;mso-wrap-distance-left:9pt;mso-wrap-distance-top:0;mso-wrap-distance-right:9pt;mso-wrap-distance-bottom:0;mso-position-horizontal:absolute;mso-position-horizontal-relative:text;mso-position-vertical:absolute;mso-position-vertical-relative:text;mso-width-percent:0;mso-height-percent:0;mso-width-relative:margin;mso-height-relative:margin;v-text-anchor:middle" o:gfxdata="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" filled="f" strokecolor="red" strokeweight="1pt">
-                <v:stroke joinstyle="miter"/>
-              </v:oval>
-            </w:pict>
-          </mc:Fallback>
-        </mc:AlternateContent>
-      </w:r>
-      <w:r>
-        <w:rPr>
-          <w:noProof/>
-          <w:vertAlign w:val="subscript"/>
-        </w:rPr>
-        <mc:AlternateContent>
-          <mc:Choice Requires="wps">
-            <w:drawing>
-              <wp:anchor distT="0" distB="0" distL="114300" distR="114300" simplePos="0" relativeHeight="251658248" behindDoc="0" locked="0" layoutInCell="1" allowOverlap="1" wp14:anchorId="10D65C35" wp14:editId="1F5391E5">
-                <wp:simplePos x="0" y="0"/>
-                <wp:positionH relativeFrom="column">
-                  <wp:posOffset>2167200</wp:posOffset>
-                </wp:positionH>
-                <wp:positionV relativeFrom="paragraph">
-                  <wp:posOffset>4290565</wp:posOffset>
-                </wp:positionV>
-                <wp:extent cx="222865" cy="222855"/>
-                <wp:effectExtent l="0" t="0" r="25400" b="25400"/>
-                <wp:wrapNone/>
-                <wp:docPr id="14" name="Oval 14"/>
-                <wp:cNvGraphicFramePr/>
-                <a:graphic xmlns:a="http://schemas.openxmlformats.org/drawingml/2006/main">
-                  <a:graphicData uri="http://schemas.microsoft.com/office/word/2010/wordprocessingShape">
-                    <wps:wsp>
-                      <wps:cNvSpPr/>
-                      <wps:spPr>
-                        <a:xfrm>
-                          <a:off x="0" y="0"/>
-                          <a:ext cx="222865" cy="222855"/>
-                        </a:xfrm>
-                        <a:prstGeom prst="ellipse">
-                          <a:avLst/>
-                        </a:prstGeom>
-                        <a:noFill/>
-                        <a:ln>
-                          <a:solidFill>
-                            <a:srgbClr val="FF0000"/>
-                          </a:solidFill>
-                        </a:ln>
-                      </wps:spPr>
-                      <wps:style>
-                        <a:lnRef idx="2">
-                          <a:schemeClr val="accent1">
-                            <a:shade val="15000"/>
-                          </a:schemeClr>
-                        </a:lnRef>
-                        <a:fillRef idx="1">
-                          <a:schemeClr val="accent1"/>
-                        </a:fillRef>
-                        <a:effectRef idx="0">
-                          <a:schemeClr val="accent1"/>
-                        </a:effectRef>
-                        <a:fontRef idx="minor">
-                          <a:schemeClr val="lt1"/>
-                        </a:fontRef>
-                      </wps:style>
-                      <wps:bodyPr rot="0" spcFirstLastPara="0" vertOverflow="overflow" horzOverflow="overflow" vert="horz" wrap="square" lIns="91440" tIns="45720" rIns="91440" bIns="45720" numCol="1" spcCol="0" rtlCol="0" fromWordArt="0" anchor="ctr" anchorCtr="0" forceAA="0" compatLnSpc="1">
-                        <a:prstTxWarp prst="textNoShape">
-                          <a:avLst/>
-                        </a:prstTxWarp>
-                        <a:noAutofit/>
-                      </wps:bodyPr>
-                    </wps:wsp>
-                  </a:graphicData>
-                </a:graphic>
-                <wp14:sizeRelH relativeFrom="margin">
-                  <wp14:pctWidth>0</wp14:pctWidth>
-                </wp14:sizeRelH>
-                <wp14:sizeRelV relativeFrom="margin">
-                  <wp14:pctHeight>0</wp14:pctHeight>
-                </wp14:sizeRelV>
-              </wp:anchor>
-            </w:drawing>
-          </mc:Choice>
-          <mc:Fallback>
-            <w:pict>
-              <v:oval w14:anchorId="259A66C1" id="Oval 14" o:spid="_x0000_s1026" style="position:absolute;margin-left:170.65pt;margin-top:337.85pt;width:17.55pt;height:17.55pt;z-index:251658248;visibility:visible;mso-wrap-style:square;mso-width-percent:0;mso-height-percent:0;mso-wrap-distance-left:9pt;mso-wrap-distance-top:0;mso-wrap-distance-right:9pt;mso-wrap-distance-bottom:0;mso-position-horizontal:absolute;mso-position-horizontal-relative:text;mso-position-vertical:absolute;mso-position-vertical-relative:text;mso-width-percent:0;mso-height-percent:0;mso-width-relative:margin;mso-height-relative:margin;v-text-anchor:middle" o:gfxdata="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" filled="f" strokecolor="red" strokeweight="1pt">
-                <v:stroke joinstyle="miter"/>
-              </v:oval>
-            </w:pict>
-          </mc:Fallback>
-        </mc:AlternateContent>
-      </w:r>
-      <w:r>
-        <w:rPr>
-          <w:noProof/>
-          <w:vertAlign w:val="subscript"/>
-        </w:rPr>
-        <mc:AlternateContent>
-          <mc:Choice Requires="wps">
-            <w:drawing>
-              <wp:anchor distT="0" distB="0" distL="114300" distR="114300" simplePos="0" relativeHeight="251658246" behindDoc="0" locked="0" layoutInCell="1" allowOverlap="1" wp14:anchorId="76218029" wp14:editId="2A255E6F">
-                <wp:simplePos x="0" y="0"/>
-                <wp:positionH relativeFrom="column">
-                  <wp:posOffset>2188800</wp:posOffset>
-                </wp:positionH>
-                <wp:positionV relativeFrom="paragraph">
-                  <wp:posOffset>7518260</wp:posOffset>
-                </wp:positionV>
-                <wp:extent cx="222865" cy="222855"/>
-                <wp:effectExtent l="0" t="0" r="25400" b="25400"/>
-                <wp:wrapNone/>
-                <wp:docPr id="12" name="Oval 12"/>
-                <wp:cNvGraphicFramePr/>
-                <a:graphic xmlns:a="http://schemas.openxmlformats.org/drawingml/2006/main">
-                  <a:graphicData uri="http://schemas.microsoft.com/office/word/2010/wordprocessingShape">
-                    <wps:wsp>
-                      <wps:cNvSpPr/>
-                      <wps:spPr>
-                        <a:xfrm>
-                          <a:off x="0" y="0"/>
-                          <a:ext cx="222865" cy="222855"/>
-                        </a:xfrm>
-                        <a:prstGeom prst="ellipse">
-                          <a:avLst/>
-                        </a:prstGeom>
-                        <a:noFill/>
-                        <a:ln>
-                          <a:solidFill>
-                            <a:srgbClr val="FF0000"/>
-                          </a:solidFill>
-                        </a:ln>
-                      </wps:spPr>
-                      <wps:style>
-                        <a:lnRef idx="2">
-                          <a:schemeClr val="accent1">
-                            <a:shade val="15000"/>
-                          </a:schemeClr>
-                        </a:lnRef>
-                        <a:fillRef idx="1">
-                          <a:schemeClr val="accent1"/>
-                        </a:fillRef>
-                        <a:effectRef idx="0">
-                          <a:schemeClr val="accent1"/>
-                        </a:effectRef>
-                        <a:fontRef idx="minor">
-                          <a:schemeClr val="lt1"/>
-                        </a:fontRef>
-                      </wps:style>
-                      <wps:bodyPr rot="0" spcFirstLastPara="0" vertOverflow="overflow" horzOverflow="overflow" vert="horz" wrap="square" lIns="91440" tIns="45720" rIns="91440" bIns="45720" numCol="1" spcCol="0" rtlCol="0" fromWordArt="0" anchor="ctr" anchorCtr="0" forceAA="0" compatLnSpc="1">
-                        <a:prstTxWarp prst="textNoShape">
-                          <a:avLst/>
-                        </a:prstTxWarp>
-                        <a:noAutofit/>
-                      </wps:bodyPr>
-                    </wps:wsp>
-                  </a:graphicData>
-                </a:graphic>
-                <wp14:sizeRelH relativeFrom="margin">
-                  <wp14:pctWidth>0</wp14:pctWidth>
-                </wp14:sizeRelH>
-                <wp14:sizeRelV relativeFrom="margin">
-                  <wp14:pctHeight>0</wp14:pctHeight>
-                </wp14:sizeRelV>
-              </wp:anchor>
-            </w:drawing>
-          </mc:Choice>
-          <mc:Fallback>
-            <w:pict>
-              <v:oval w14:anchorId="681F6563" id="Oval 12" o:spid="_x0000_s1026" style="position:absolute;margin-left:172.35pt;margin-top:592pt;width:17.55pt;height:17.55pt;z-index:251658246;visibility:visible;mso-wrap-style:square;mso-width-percent:0;mso-height-percent:0;mso-wrap-distance-left:9pt;mso-wrap-distance-top:0;mso-wrap-distance-right:9pt;mso-wrap-distance-bottom:0;mso-position-horizontal:absolute;mso-position-horizontal-relative:text;mso-position-vertical:absolute;mso-position-vertical-relative:text;mso-width-percent:0;mso-height-percent:0;mso-width-relative:margin;mso-height-relative:margin;v-text-anchor:middle" o:gfxdata="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" filled="f" strokecolor="red" strokeweight="1pt">
-                <v:stroke joinstyle="miter"/>
-              </v:oval>
-            </w:pict>
-          </mc:Fallback>
-        </mc:AlternateContent>
-      </w:r>
-      <w:r>
-        <w:rPr>
-          <w:noProof/>
-          <w:vertAlign w:val="subscript"/>
-        </w:rPr>
-        <w:softHyphen/>
-      </w:r>
-      <w:r>
-        <w:rPr>
-          <w:noProof/>
-          <w:vertAlign w:val="subscript"/>
-        </w:rPr>
-        <w:softHyphen/>
-      </w:r>
-      <w:r>
-        <w:rPr>
-          <w:noProof/>
-          <w:vertAlign w:val="subscript"/>
-        </w:rPr>
-        <mc:AlternateContent>
-          <mc:Choice Requires="wps">
-            <w:drawing>
-              <wp:anchor distT="0" distB="0" distL="114300" distR="114300" simplePos="0" relativeHeight="251658247" behindDoc="0" locked="0" layoutInCell="1" allowOverlap="1" wp14:anchorId="1567CABC" wp14:editId="49D953D4">
+              <wp:anchor distT="0" distB="0" distL="114300" distR="114300" simplePos="0" relativeHeight="251658247" behindDoc="0" locked="0" layoutInCell="1" allowOverlap="1" wp14:anchorId="1567CABC" wp14:editId="14C9C030">
                 <wp:simplePos x="0" y="0"/>
                 <wp:positionH relativeFrom="column">
                   <wp:posOffset>-1353707</wp:posOffset>
@@ -12937,53 +12663,12 @@
           </mc:Choice>
           <mc:Fallback>
             <w:pict>
-              <v:oval w14:anchorId="6DB5FC37" id="Oval 13" o:spid="_x0000_s1026" style="position:absolute;margin-left:-106.6pt;margin-top:271.65pt;width:17.55pt;height:17.55pt;z-index:251658247;visibility:visible;mso-wrap-style:square;mso-width-percent:0;mso-height-percent:0;mso-wrap-distance-left:9pt;mso-wrap-distance-top:0;mso-wrap-distance-right:9pt;mso-wrap-distance-bottom:0;mso-position-horizontal:absolute;mso-position-horizontal-relative:text;mso-position-vertical:absolute;mso-position-vertical-relative:text;mso-width-percent:0;mso-height-percent:0;mso-width-relative:margin;mso-height-relative:margin;v-text-anchor:middle" o:gfxdata="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" filled="f" strokecolor="red" strokeweight="1pt">
+              <v:oval w14:anchorId="019464BD" id="Oval 13" o:spid="_x0000_s1026" style="position:absolute;margin-left:-106.6pt;margin-top:271.65pt;width:17.55pt;height:17.55pt;z-index:251658247;visibility:visible;mso-wrap-style:square;mso-width-percent:0;mso-height-percent:0;mso-wrap-distance-left:9pt;mso-wrap-distance-top:0;mso-wrap-distance-right:9pt;mso-wrap-distance-bottom:0;mso-position-horizontal:absolute;mso-position-horizontal-relative:text;mso-position-vertical:absolute;mso-position-vertical-relative:text;mso-width-percent:0;mso-height-percent:0;mso-width-relative:margin;mso-height-relative:margin;v-text-anchor:middle" o:gfxdata="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" filled="f" strokecolor="red" strokeweight="1pt">
                 <v:stroke joinstyle="miter"/>
               </v:oval>
             </w:pict>
           </mc:Fallback>
         </mc:AlternateContent>
-      </w:r>
-      <w:r>
-        <w:rPr>
-          <w:noProof/>
-          <w:vertAlign w:val="subscript"/>
-        </w:rPr>
-        <w:drawing>
-          <wp:inline distT="0" distB="0" distL="0" distR="0" wp14:anchorId="34051F94" wp14:editId="3AAB32C0">
-            <wp:extent cx="8358582" cy="1535401"/>
-            <wp:effectExtent l="1905" t="0" r="6350" b="6350"/>
-            <wp:docPr id="11" name="Picture 11"/>
-            <wp:cNvGraphicFramePr>
-              <a:graphicFrameLocks xmlns:a="http://schemas.openxmlformats.org/drawingml/2006/main" noChangeAspect="1"/>
-            </wp:cNvGraphicFramePr>
-            <a:graphic xmlns:a="http://schemas.openxmlformats.org/drawingml/2006/main">
-              <a:graphicData uri="http://schemas.openxmlformats.org/drawingml/2006/picture">
-                <pic:pic xmlns:pic="http://schemas.openxmlformats.org/drawingml/2006/picture">
-                  <pic:nvPicPr>
-                    <pic:cNvPr id="1" name=""/>
-                    <pic:cNvPicPr/>
-                  </pic:nvPicPr>
-                  <pic:blipFill>
-                    <a:blip r:embed="rId18"/>
-                    <a:stretch>
-                      <a:fillRect/>
-                    </a:stretch>
-                  </pic:blipFill>
-                  <pic:spPr>
-                    <a:xfrm rot="16200000">
-                      <a:off x="0" y="0"/>
-                      <a:ext cx="8369436" cy="1537395"/>
-                    </a:xfrm>
-                    <a:prstGeom prst="rect">
-                      <a:avLst/>
-                    </a:prstGeom>
-                  </pic:spPr>
-                </pic:pic>
-              </a:graphicData>
-            </a:graphic>
-          </wp:inline>
-        </w:drawing>
       </w:r>
       <w:bookmarkStart w:id="2" w:name="page2"/>
       <w:bookmarkEnd w:id="0"/>
@@ -15888,26 +15573,6 @@
 </file>
 
 <file path=customXml/item1.xml><?xml version="1.0" encoding="utf-8"?>
-<p:properties xmlns:p="http://schemas.microsoft.com/office/2006/metadata/properties" xmlns:xsi="http://www.w3.org/2001/XMLSchema-instance" xmlns:pc="http://schemas.microsoft.com/office/infopath/2007/PartnerControls">
-  <documentManagement>
-    <lcf76f155ced4ddcb4097134ff3c332f xmlns="49b67118-50a5-4d3e-89b7-9848e8a6257b">
-      <Terms xmlns="http://schemas.microsoft.com/office/infopath/2007/PartnerControls"/>
-    </lcf76f155ced4ddcb4097134ff3c332f>
-    <TaxCatchAll xmlns="876e04ec-c44d-45fb-a45b-87644b3a9fdd" xsi:nil="true"/>
-  </documentManagement>
-</p:properties>
-</file>
-
-<file path=customXml/item2.xml><?xml version="1.0" encoding="utf-8"?>
-<?mso-contentType ?>
-<FormTemplates xmlns="http://schemas.microsoft.com/sharepoint/v3/contenttype/forms">
-  <Display>DocumentLibraryForm</Display>
-  <Edit>DocumentLibraryForm</Edit>
-  <New>DocumentLibraryForm</New>
-</FormTemplates>
-</file>
-
-<file path=customXml/item3.xml><?xml version="1.0" encoding="utf-8"?>
 <ct:contentTypeSchema xmlns:ct="http://schemas.microsoft.com/office/2006/metadata/contentType" xmlns:ma="http://schemas.microsoft.com/office/2006/metadata/properties/metaAttributes" ct:_="" ma:_="" ma:contentTypeName="Document" ma:contentTypeID="0x010100663712DCE29D0945B25F4C5A40C282BF" ma:contentTypeVersion="12" ma:contentTypeDescription="Create a new document." ma:contentTypeScope="" ma:versionID="fcfa37499a7459845d01f12cf1c09b9b">
   <xsd:schema xmlns:xsd="http://www.w3.org/2001/XMLSchema" xmlns:xs="http://www.w3.org/2001/XMLSchema" xmlns:p="http://schemas.microsoft.com/office/2006/metadata/properties" xmlns:ns2="49b67118-50a5-4d3e-89b7-9848e8a6257b" xmlns:ns3="876e04ec-c44d-45fb-a45b-87644b3a9fdd" targetNamespace="http://schemas.microsoft.com/office/2006/metadata/properties" ma:root="true" ma:fieldsID="4a0dc762b5d20e9128f6e5959d8fc2f5" ns2:_="" ns3:_="">
     <xsd:import namespace="49b67118-50a5-4d3e-89b7-9848e8a6257b"/>
@@ -16102,30 +15767,31 @@
 </ct:contentTypeSchema>
 </file>
 
+<file path=customXml/item2.xml><?xml version="1.0" encoding="utf-8"?>
+<?mso-contentType ?>
+<FormTemplates xmlns="http://schemas.microsoft.com/sharepoint/v3/contenttype/forms">
+  <Display>DocumentLibraryForm</Display>
+  <Edit>DocumentLibraryForm</Edit>
+  <New>DocumentLibraryForm</New>
+</FormTemplates>
+</file>
+
+<file path=customXml/item3.xml><?xml version="1.0" encoding="utf-8"?>
+<p:properties xmlns:p="http://schemas.microsoft.com/office/2006/metadata/properties" xmlns:xsi="http://www.w3.org/2001/XMLSchema-instance" xmlns:pc="http://schemas.microsoft.com/office/infopath/2007/PartnerControls">
+  <documentManagement>
+    <lcf76f155ced4ddcb4097134ff3c332f xmlns="49b67118-50a5-4d3e-89b7-9848e8a6257b">
+      <Terms xmlns="http://schemas.microsoft.com/office/infopath/2007/PartnerControls"/>
+    </lcf76f155ced4ddcb4097134ff3c332f>
+    <TaxCatchAll xmlns="876e04ec-c44d-45fb-a45b-87644b3a9fdd" xsi:nil="true"/>
+  </documentManagement>
+</p:properties>
+</file>
+
 <file path=customXml/item4.xml><?xml version="1.0" encoding="utf-8"?>
 <b:Sources xmlns:b="http://schemas.openxmlformats.org/officeDocument/2006/bibliography" xmlns="http://schemas.openxmlformats.org/officeDocument/2006/bibliography" SelectedStyle="\APASixthEditionOfficeOnline.xsl" StyleName="APA" Version="6"/>
 </file>
 
 <file path=customXml/itemProps1.xml><?xml version="1.0" encoding="utf-8"?>
-<ds:datastoreItem xmlns:ds="http://schemas.openxmlformats.org/officeDocument/2006/customXml" ds:itemID="{F0FA16F4-B3B5-4912-B9B6-0EFF6DB2AB2E}">
-  <ds:schemaRefs>
-    <ds:schemaRef ds:uri="http://schemas.microsoft.com/office/2006/metadata/properties"/>
-    <ds:schemaRef ds:uri="http://schemas.microsoft.com/office/infopath/2007/PartnerControls"/>
-    <ds:schemaRef ds:uri="49b67118-50a5-4d3e-89b7-9848e8a6257b"/>
-    <ds:schemaRef ds:uri="876e04ec-c44d-45fb-a45b-87644b3a9fdd"/>
-  </ds:schemaRefs>
-</ds:datastoreItem>
-</file>
-
-<file path=customXml/itemProps2.xml><?xml version="1.0" encoding="utf-8"?>
-<ds:datastoreItem xmlns:ds="http://schemas.openxmlformats.org/officeDocument/2006/customXml" ds:itemID="{A0C1A221-436E-42DA-97DA-47502C48A139}">
-  <ds:schemaRefs>
-    <ds:schemaRef ds:uri="http://schemas.microsoft.com/sharepoint/v3/contenttype/forms"/>
-  </ds:schemaRefs>
-</ds:datastoreItem>
-</file>
-
-<file path=customXml/itemProps3.xml><?xml version="1.0" encoding="utf-8"?>
 <ds:datastoreItem xmlns:ds="http://schemas.openxmlformats.org/officeDocument/2006/customXml" ds:itemID="{EE464A99-880F-4ABD-8281-73BDBD33F722}">
   <ds:schemaRefs>
     <ds:schemaRef ds:uri="http://schemas.microsoft.com/office/2006/metadata/contentType"/>
@@ -16144,6 +15810,25 @@
 </ds:datastoreItem>
 </file>
 
+<file path=customXml/itemProps2.xml><?xml version="1.0" encoding="utf-8"?>
+<ds:datastoreItem xmlns:ds="http://schemas.openxmlformats.org/officeDocument/2006/customXml" ds:itemID="{A0C1A221-436E-42DA-97DA-47502C48A139}">
+  <ds:schemaRefs>
+    <ds:schemaRef ds:uri="http://schemas.microsoft.com/sharepoint/v3/contenttype/forms"/>
+  </ds:schemaRefs>
+</ds:datastoreItem>
+</file>
+
+<file path=customXml/itemProps3.xml><?xml version="1.0" encoding="utf-8"?>
+<ds:datastoreItem xmlns:ds="http://schemas.openxmlformats.org/officeDocument/2006/customXml" ds:itemID="{F0FA16F4-B3B5-4912-B9B6-0EFF6DB2AB2E}">
+  <ds:schemaRefs>
+    <ds:schemaRef ds:uri="http://schemas.microsoft.com/office/2006/metadata/properties"/>
+    <ds:schemaRef ds:uri="http://schemas.microsoft.com/office/infopath/2007/PartnerControls"/>
+    <ds:schemaRef ds:uri="49b67118-50a5-4d3e-89b7-9848e8a6257b"/>
+    <ds:schemaRef ds:uri="876e04ec-c44d-45fb-a45b-87644b3a9fdd"/>
+  </ds:schemaRefs>
+</ds:datastoreItem>
+</file>
+
 <file path=customXml/itemProps4.xml><?xml version="1.0" encoding="utf-8"?>
 <ds:datastoreItem xmlns:ds="http://schemas.openxmlformats.org/officeDocument/2006/customXml" ds:itemID="{35695F99-B626-4191-B469-724B0EB6D6EA}">
   <ds:schemaRefs>

</xml_diff>